<commit_message>
Update final enhancement narratives
</commit_message>
<xml_diff>
--- a/narratives/Enhancement 1 - Software Design and Engineering Narrative.docx
+++ b/narratives/Enhancement 1 - Software Design and Engineering Narrative.docx
@@ -204,13 +204,6 @@
     </w:p>
     <w:p>
       <w:pPr>
-        <w:rPr>
-          <w:rFonts w:ascii="Times New Roman" w:hAnsi="Times New Roman" w:cs="Times New Roman"/>
-        </w:rPr>
-      </w:pPr>
-    </w:p>
-    <w:p>
-      <w:pPr>
         <w:spacing w:after="0" w:line="480" w:lineRule="auto"/>
         <w:ind w:firstLine="720"/>
         <w:rPr>
@@ -222,19 +215,44 @@
           <w:rFonts w:ascii="Times New Roman" w:hAnsi="Times New Roman" w:cs="Times New Roman"/>
         </w:rPr>
         <w:lastRenderedPageBreak/>
-        <w:t xml:space="preserve">The artifact I selected is the Animal Shelter Dashboard that I originally </w:t>
+        <w:t>The artifact I selected is the Animal Shelter Dashboard that I originally worked on in CS 340: Client Server Development. The application uses Python and Dash to display animal shelter records stored in MongoDB, while a CRUD module handles communication with the database. The original dashboard allowed users to filter animals for specialized rescue work and then view the results through the interface. I selected this artifact because it already demonstrated software development skills, but the original version placed too much responsibility inside the Jupyter Notebook and dashboard callbacks. The rescue requirements were also hardcoded directly into the filtering logic, which made the program harder to maintain if those requirements needed to change later.</w:t>
+      </w:r>
+    </w:p>
+    <w:p>
+      <w:pPr>
+        <w:spacing w:after="0" w:line="480" w:lineRule="auto"/>
+        <w:ind w:firstLine="720"/>
+        <w:rPr>
+          <w:rFonts w:ascii="Times New Roman" w:hAnsi="Times New Roman" w:cs="Times New Roman"/>
+        </w:rPr>
+      </w:pPr>
+      <w:r>
+        <w:rPr>
+          <w:rFonts w:ascii="Times New Roman" w:hAnsi="Times New Roman" w:cs="Times New Roman"/>
+        </w:rPr>
+        <w:t>For this enhancement, I reorganized the application so different parts of the program have clearer responsibilities. The dashboard now focuses on displaying information and receiving input, while separate service modules handle the processing behind those actions. Database access remains separated through the CRUD module, which helps keep the application structure a lot easier to follow. I also separated general animal browsing from the rescue-candidate search, and users can now browse animals by type, while the rescue side continues to use the rescue categories. The main difference is that those rescue requirements now come from rescue profiles instead of being hardcoded directly into the callback. Those profiles can now also be reviewed and changed through a separate configuration page, which should make future updates much easier to do without placing more logic inside the dashboard itself.</w:t>
+      </w:r>
+    </w:p>
+    <w:p>
+      <w:pPr>
+        <w:spacing w:after="0" w:line="480" w:lineRule="auto"/>
+        <w:ind w:firstLine="720"/>
+        <w:rPr>
+          <w:rFonts w:ascii="Times New Roman" w:hAnsi="Times New Roman" w:cs="Times New Roman"/>
+        </w:rPr>
+      </w:pPr>
+      <w:r>
+        <w:rPr>
+          <w:rFonts w:ascii="Times New Roman" w:hAnsi="Times New Roman" w:cs="Times New Roman"/>
+        </w:rPr>
+        <w:t xml:space="preserve">The enhancement made progress toward several course outcomes. The strongest progress was toward the outcome involving the design and evaluation of computing solutions because I had to reconsider how the different parts of the application should all work together. The best example of this was the rescue-profile management. My original plan was to include this </w:t>
       </w:r>
       <w:r>
         <w:rPr>
           <w:rFonts w:ascii="Times New Roman" w:hAnsi="Times New Roman" w:cs="Times New Roman"/>
         </w:rPr>
-        <w:t>worked on</w:t>
-      </w:r>
-      <w:r>
-        <w:rPr>
-          <w:rFonts w:ascii="Times New Roman" w:hAnsi="Times New Roman" w:cs="Times New Roman"/>
-        </w:rPr>
-        <w:t xml:space="preserve"> in CS 340: Client Server Development. The application uses Python and Dash to display animal shelter records stored in MongoDB, while a CRUD module handles communication with the database. The original dashboard allowed users to filter animals for specialized rescue work and then view the results through the interface. I selected this artifact because it already demonstrated software development skills, but the original version placed too much responsibility inside the Jupyter Notebook and dashboard callbacks. The rescue requirements were also hardcoded directly into the filtering logic, which made the program harder to maintain if those requirements needed to change later.</w:t>
+        <w:lastRenderedPageBreak/>
+        <w:t>functionality with the normal dashboard, but while implementing it I noticed there was a potential problem because general users shouldn’t just be able to change the requirements used for rescue searches. I separated that functionality from the normal dashboard and moved it to a configuration page instead.</w:t>
       </w:r>
     </w:p>
     <w:p>
@@ -249,43 +267,7 @@
         <w:rPr>
           <w:rFonts w:ascii="Times New Roman" w:hAnsi="Times New Roman" w:cs="Times New Roman"/>
         </w:rPr>
-        <w:t xml:space="preserve">For this enhancement, I reorganized the application so different parts of the program have clearer responsibilities. The dashboard now focuses on displaying information and receiving input, while separate service modules handle the processing behind those actions. Database access remains separated through the CRUD module, which helps keep the application structure a lot easier to follow. I also separated general animal browsing from the rescue-candidate search, and users can now browse animals by type, while the rescue side continues to use the rescue categories. The main difference is that those rescue requirements now come from rescue profiles instead of being hardcoded directly into the callback. Those profiles can </w:t>
-      </w:r>
-      <w:r>
-        <w:rPr>
-          <w:rFonts w:ascii="Times New Roman" w:hAnsi="Times New Roman" w:cs="Times New Roman"/>
-        </w:rPr>
-        <w:t xml:space="preserve">now </w:t>
-      </w:r>
-      <w:r>
-        <w:rPr>
-          <w:rFonts w:ascii="Times New Roman" w:hAnsi="Times New Roman" w:cs="Times New Roman"/>
-        </w:rPr>
-        <w:t>also be reviewed and changed through a separate configuration page, which should make future updates</w:t>
-      </w:r>
-      <w:r>
-        <w:rPr>
-          <w:rFonts w:ascii="Times New Roman" w:hAnsi="Times New Roman" w:cs="Times New Roman"/>
-        </w:rPr>
-        <w:t xml:space="preserve"> much</w:t>
-      </w:r>
-      <w:r>
-        <w:rPr>
-          <w:rFonts w:ascii="Times New Roman" w:hAnsi="Times New Roman" w:cs="Times New Roman"/>
-        </w:rPr>
-        <w:t xml:space="preserve"> easier</w:t>
-      </w:r>
-      <w:r>
-        <w:rPr>
-          <w:rFonts w:ascii="Times New Roman" w:hAnsi="Times New Roman" w:cs="Times New Roman"/>
-        </w:rPr>
-        <w:t xml:space="preserve"> to do</w:t>
-      </w:r>
-      <w:r>
-        <w:rPr>
-          <w:rFonts w:ascii="Times New Roman" w:hAnsi="Times New Roman" w:cs="Times New Roman"/>
-        </w:rPr>
-        <w:t xml:space="preserve"> without placing more logic inside the dashboard itself.</w:t>
+        <w:t>I did not implement authentication during this enhancement because I wanted to keep the work within its intended scope. I also made great progress toward the outcome involving computing techniques by using modular Python files and Dash routing to improve the structure of the application. The collaboration outcome is supported by keeping rescue requirements in a consistent profile structure. Persistent storage and sharing of that information was intentionally left for the database enhancement that followed.</w:t>
       </w:r>
     </w:p>
     <w:p>
@@ -300,219 +282,17 @@
         <w:rPr>
           <w:rFonts w:ascii="Times New Roman" w:hAnsi="Times New Roman" w:cs="Times New Roman"/>
         </w:rPr>
-        <w:t xml:space="preserve">The enhancement made progress toward the course outcomes I identified in Module One. The strongest progress was toward the outcome involving the design and evaluation of computing solutions because I had to reconsider how the different parts of the application should </w:t>
+        <w:t>The biggest takeaway from this enhancement was that improving an existing program isn’t always limited to following the original plan exactly. Some of my design problems became more noticeable once I started separating the application into smaller parts. I had to decide where processing should happen and how profile information should move through the application. I also had to figure out how the normal dashboard should differ from the configuration functionality. Moving the original files into a new project structure also caused some temporary import and file-location problems, which required me to verify that each module was being loaded from the right location. These challenges helped me understand why separation of responsibilities is important in software design. The enhancement kept the original functionality while giving the application a structure that made it easier for me to continue building on it during the later enhancements.</w:t>
       </w:r>
-      <w:r>
-        <w:rPr>
-          <w:rFonts w:ascii="Times New Roman" w:hAnsi="Times New Roman" w:cs="Times New Roman"/>
-        </w:rPr>
-        <w:t xml:space="preserve">all </w:t>
-      </w:r>
-      <w:r>
-        <w:rPr>
-          <w:rFonts w:ascii="Times New Roman" w:hAnsi="Times New Roman" w:cs="Times New Roman"/>
-        </w:rPr>
-        <w:t xml:space="preserve">work together. </w:t>
-      </w:r>
-      <w:r>
-        <w:rPr>
-          <w:rFonts w:ascii="Times New Roman" w:hAnsi="Times New Roman" w:cs="Times New Roman"/>
-        </w:rPr>
-        <w:t>The best</w:t>
-      </w:r>
-      <w:r>
-        <w:rPr>
-          <w:rFonts w:ascii="Times New Roman" w:hAnsi="Times New Roman" w:cs="Times New Roman"/>
-        </w:rPr>
-        <w:t xml:space="preserve"> example</w:t>
-      </w:r>
-      <w:r>
-        <w:rPr>
-          <w:rFonts w:ascii="Times New Roman" w:hAnsi="Times New Roman" w:cs="Times New Roman"/>
-        </w:rPr>
-        <w:t xml:space="preserve"> of this</w:t>
-      </w:r>
-      <w:r>
-        <w:rPr>
-          <w:rFonts w:ascii="Times New Roman" w:hAnsi="Times New Roman" w:cs="Times New Roman"/>
-        </w:rPr>
-        <w:t xml:space="preserve"> was</w:t>
-      </w:r>
-      <w:r>
-        <w:rPr>
-          <w:rFonts w:ascii="Times New Roman" w:hAnsi="Times New Roman" w:cs="Times New Roman"/>
-        </w:rPr>
-        <w:t xml:space="preserve"> the</w:t>
-      </w:r>
-      <w:r>
-        <w:rPr>
-          <w:rFonts w:ascii="Times New Roman" w:hAnsi="Times New Roman" w:cs="Times New Roman"/>
-        </w:rPr>
-        <w:t xml:space="preserve"> rescue-profile management. My original plan </w:t>
-      </w:r>
-      <w:r>
-        <w:rPr>
-          <w:rFonts w:ascii="Times New Roman" w:hAnsi="Times New Roman" w:cs="Times New Roman"/>
-        </w:rPr>
-        <w:lastRenderedPageBreak/>
-        <w:t xml:space="preserve">was to include this functionality with the normal dashboard, but while implementing it I </w:t>
-      </w:r>
-      <w:r>
-        <w:rPr>
-          <w:rFonts w:ascii="Times New Roman" w:hAnsi="Times New Roman" w:cs="Times New Roman"/>
-        </w:rPr>
-        <w:t>noticed there was</w:t>
-      </w:r>
-      <w:r>
-        <w:rPr>
-          <w:rFonts w:ascii="Times New Roman" w:hAnsi="Times New Roman" w:cs="Times New Roman"/>
-        </w:rPr>
-        <w:t xml:space="preserve"> a potential problem because general users </w:t>
-      </w:r>
-      <w:r>
-        <w:rPr>
-          <w:rFonts w:ascii="Times New Roman" w:hAnsi="Times New Roman" w:cs="Times New Roman"/>
-        </w:rPr>
-        <w:t xml:space="preserve">shouldn’t just </w:t>
-      </w:r>
-      <w:r>
-        <w:rPr>
-          <w:rFonts w:ascii="Times New Roman" w:hAnsi="Times New Roman" w:cs="Times New Roman"/>
-        </w:rPr>
-        <w:t>be able to change the requirements used for rescue searches. I separated that functionality from the normal dashboard and moved it to a configuration page instead</w:t>
-      </w:r>
-      <w:r>
-        <w:rPr>
-          <w:rFonts w:ascii="Times New Roman" w:hAnsi="Times New Roman" w:cs="Times New Roman"/>
-        </w:rPr>
-        <w:t>.</w:t>
-      </w:r>
-    </w:p>
-    <w:p>
-      <w:pPr>
-        <w:spacing w:after="0" w:line="480" w:lineRule="auto"/>
+    </w:p>
+    <w:p>
+      <w:pPr>
+        <w:spacing w:line="480" w:lineRule="auto"/>
         <w:ind w:firstLine="720"/>
         <w:rPr>
           <w:rFonts w:ascii="Times New Roman" w:hAnsi="Times New Roman" w:cs="Times New Roman"/>
         </w:rPr>
       </w:pPr>
-      <w:r>
-        <w:rPr>
-          <w:rFonts w:ascii="Times New Roman" w:hAnsi="Times New Roman" w:cs="Times New Roman"/>
-        </w:rPr>
-        <w:t xml:space="preserve">I have not implemented authentication yet because I </w:t>
-      </w:r>
-      <w:r>
-        <w:rPr>
-          <w:rFonts w:ascii="Times New Roman" w:hAnsi="Times New Roman" w:cs="Times New Roman"/>
-        </w:rPr>
-        <w:t>don’t</w:t>
-      </w:r>
-      <w:r>
-        <w:rPr>
-          <w:rFonts w:ascii="Times New Roman" w:hAnsi="Times New Roman" w:cs="Times New Roman"/>
-        </w:rPr>
-        <w:t xml:space="preserve"> want to expand the enhancement beyond its intended scope without</w:t>
-      </w:r>
-      <w:r>
-        <w:rPr>
-          <w:rFonts w:ascii="Times New Roman" w:hAnsi="Times New Roman" w:cs="Times New Roman"/>
-        </w:rPr>
-        <w:t xml:space="preserve"> any feedback.</w:t>
-      </w:r>
-      <w:r>
-        <w:rPr>
-          <w:rFonts w:ascii="Times New Roman" w:hAnsi="Times New Roman" w:cs="Times New Roman"/>
-        </w:rPr>
-        <w:t xml:space="preserve"> I also made </w:t>
-      </w:r>
-      <w:r>
-        <w:rPr>
-          <w:rFonts w:ascii="Times New Roman" w:hAnsi="Times New Roman" w:cs="Times New Roman"/>
-        </w:rPr>
-        <w:t xml:space="preserve">great </w:t>
-      </w:r>
-      <w:r>
-        <w:rPr>
-          <w:rFonts w:ascii="Times New Roman" w:hAnsi="Times New Roman" w:cs="Times New Roman"/>
-        </w:rPr>
-        <w:t xml:space="preserve">progress toward the outcome involving computing techniques by using modular Python files and Dash routing to improve the structure of the application. The collaboration outcome is supported by keeping rescue requirements in a consistent profile structure, although persistent sharing between users </w:t>
-      </w:r>
-      <w:r>
-        <w:rPr>
-          <w:rFonts w:ascii="Times New Roman" w:hAnsi="Times New Roman" w:cs="Times New Roman"/>
-        </w:rPr>
-        <w:t xml:space="preserve">won’t </w:t>
-      </w:r>
-      <w:r>
-        <w:rPr>
-          <w:rFonts w:ascii="Times New Roman" w:hAnsi="Times New Roman" w:cs="Times New Roman"/>
-        </w:rPr>
-        <w:t xml:space="preserve">be added until </w:t>
-      </w:r>
-      <w:r>
-        <w:rPr>
-          <w:rFonts w:ascii="Times New Roman" w:hAnsi="Times New Roman" w:cs="Times New Roman"/>
-        </w:rPr>
-        <w:t xml:space="preserve">it’s time to work on </w:t>
-      </w:r>
-      <w:r>
-        <w:rPr>
-          <w:rFonts w:ascii="Times New Roman" w:hAnsi="Times New Roman" w:cs="Times New Roman"/>
-        </w:rPr>
-        <w:t>the database enhancement.</w:t>
-      </w:r>
-    </w:p>
-    <w:p>
-      <w:pPr>
-        <w:spacing w:line="480" w:lineRule="auto"/>
-        <w:ind w:firstLine="720"/>
-        <w:rPr>
-          <w:rFonts w:ascii="Times New Roman" w:hAnsi="Times New Roman" w:cs="Times New Roman"/>
-        </w:rPr>
-      </w:pPr>
-      <w:r>
-        <w:rPr>
-          <w:rFonts w:ascii="Times New Roman" w:hAnsi="Times New Roman" w:cs="Times New Roman"/>
-        </w:rPr>
-        <w:t>The biggest takeaway from this enhancement was that improving an existing program isn’t always limited to following the original plan exactly. Some</w:t>
-      </w:r>
-      <w:r>
-        <w:rPr>
-          <w:rFonts w:ascii="Times New Roman" w:hAnsi="Times New Roman" w:cs="Times New Roman"/>
-        </w:rPr>
-        <w:t xml:space="preserve"> of my</w:t>
-      </w:r>
-      <w:r>
-        <w:rPr>
-          <w:rFonts w:ascii="Times New Roman" w:hAnsi="Times New Roman" w:cs="Times New Roman"/>
-        </w:rPr>
-        <w:t xml:space="preserve"> design problems became more noticeable once I started separating the application into smaller parts. I had to decide where processing should </w:t>
-      </w:r>
-      <w:r>
-        <w:rPr>
-          <w:rFonts w:ascii="Times New Roman" w:hAnsi="Times New Roman" w:cs="Times New Roman"/>
-        </w:rPr>
-        <w:t>happen</w:t>
-      </w:r>
-      <w:r>
-        <w:rPr>
-          <w:rFonts w:ascii="Times New Roman" w:hAnsi="Times New Roman" w:cs="Times New Roman"/>
-        </w:rPr>
-        <w:t xml:space="preserve"> and how profile information should move through the application. I also had to </w:t>
-      </w:r>
-      <w:r>
-        <w:rPr>
-          <w:rFonts w:ascii="Times New Roman" w:hAnsi="Times New Roman" w:cs="Times New Roman"/>
-        </w:rPr>
-        <w:t xml:space="preserve">figure out </w:t>
-      </w:r>
-      <w:r>
-        <w:rPr>
-          <w:rFonts w:ascii="Times New Roman" w:hAnsi="Times New Roman" w:cs="Times New Roman"/>
-        </w:rPr>
-        <w:t>how the normal dashboard should differ from the configuration functionality. Moving the original files into a new project structure also caused some temporary import and file-location problems, which required me to verify that each module was being loaded from the right location. These challenges helped me understand why separation of responsibilities is important in software design. The enhancement keeps the original functionality while giving the application a structure that should be easier for me to test and work on as I continue with the rest of my enhancements.</w:t>
-      </w:r>
     </w:p>
     <w:sectPr>
       <w:headerReference w:type="default" r:id="rId6"/>
@@ -1248,7 +1028,6 @@
   <w:style w:type="character" w:default="1" w:styleId="DefaultParagraphFont">
     <w:name w:val="Default Paragraph Font"/>
     <w:uiPriority w:val="1"/>
-    <w:semiHidden/>
     <w:unhideWhenUsed/>
   </w:style>
   <w:style w:type="table" w:default="1" w:styleId="TableNormal">

</xml_diff>